<commit_message>
Commit from thinkpad on 12/05/2026, 20:55:06
</commit_message>
<xml_diff>
--- a/Sa4CPS/WP6/Sa4CPS_deliverable_D6.3-v0.0.docx
+++ b/Sa4CPS/WP6/Sa4CPS_deliverable_D6.3-v0.0.docx
@@ -14403,6 +14403,654 @@
     </w:p>
     <w:p>
       <w:pPr>
+        <w:jc w:val="both"/>
+        <w:rPr>
+          <w:lang w:val="en-US"/>
+        </w:rPr>
+      </w:pPr>
+      <w:r>
+        <w:rPr>
+          <w:lang w:val="en-US"/>
+        </w:rPr>
+        <w:t xml:space="preserve">This section summarizes the contributions of each work package (WP1–WP5) to the experiment and demonstration activities planned for the </w:t>
+      </w:r>
+      <w:r>
+        <w:rPr>
+          <w:lang w:val="en-US"/>
+        </w:rPr>
+        <w:t>second</w:t>
+      </w:r>
+      <w:r>
+        <w:rPr>
+          <w:lang w:val="en-US"/>
+        </w:rPr>
+        <w:t xml:space="preserve"> year. While the execution of the experiments and demonstrations is coordinated under WP6, the technical foundation of these activities is provided through the outputs of the other work packages. </w:t>
+      </w:r>
+    </w:p>
+    <w:p>
+      <w:pPr>
+        <w:jc w:val="both"/>
+        <w:rPr>
+          <w:lang w:val="en-US"/>
+        </w:rPr>
+      </w:pPr>
+      <w:r>
+        <w:rPr>
+          <w:lang w:val="en-US"/>
+        </w:rPr>
+        <w:t xml:space="preserve">Below, the contributions and outputs of each work package related to the </w:t>
+      </w:r>
+      <w:r>
+        <w:rPr>
+          <w:lang w:val="en-US"/>
+        </w:rPr>
+        <w:t>second</w:t>
+      </w:r>
+      <w:r>
+        <w:rPr>
+          <w:lang w:val="en-US"/>
+        </w:rPr>
+        <w:t>-year experiments and demonstrations for the respective use case are briefly described. Each WP supports the demonstrations carried out in the use cases by providing the necessary technological components and developments within its scope.</w:t>
+      </w:r>
+    </w:p>
+    <w:p>
+      <w:pPr>
+        <w:pStyle w:val="Corpodetexto"/>
+        <w:rPr>
+          <w:lang w:val="en-US"/>
+        </w:rPr>
+      </w:pPr>
+    </w:p>
+    <w:tbl>
+      <w:tblPr>
+        <w:tblW w:w="0" w:type="dxa"/>
+        <w:tblBorders>
+          <w:top w:val="outset" w:sz="6" w:space="0" w:color="auto"/>
+          <w:left w:val="outset" w:sz="6" w:space="0" w:color="auto"/>
+          <w:bottom w:val="outset" w:sz="6" w:space="0" w:color="auto"/>
+          <w:right w:val="outset" w:sz="6" w:space="0" w:color="auto"/>
+        </w:tblBorders>
+        <w:tblCellMar>
+          <w:left w:w="0" w:type="dxa"/>
+          <w:right w:w="0" w:type="dxa"/>
+        </w:tblCellMar>
+        <w:tblLook w:val="04A0" w:firstRow="1" w:lastRow="0" w:firstColumn="1" w:lastColumn="0" w:noHBand="0" w:noVBand="1"/>
+      </w:tblPr>
+      <w:tblGrid>
+        <w:gridCol w:w="2415"/>
+        <w:gridCol w:w="7215"/>
+      </w:tblGrid>
+      <w:tr>
+        <w:trPr>
+          <w:trHeight w:val="300"/>
+        </w:trPr>
+        <w:tc>
+          <w:tcPr>
+            <w:tcW w:w="2415" w:type="dxa"/>
+            <w:tcBorders>
+              <w:top w:val="single" w:sz="6" w:space="0" w:color="4A442A"/>
+              <w:left w:val="single" w:sz="6" w:space="0" w:color="4A442A"/>
+              <w:bottom w:val="single" w:sz="6" w:space="0" w:color="4A442A"/>
+              <w:right w:val="single" w:sz="6" w:space="0" w:color="4A442A"/>
+            </w:tcBorders>
+            <w:shd w:val="clear" w:color="auto" w:fill="D6E3BC"/>
+            <w:hideMark/>
+          </w:tcPr>
+          <w:p>
+            <w:pPr>
+              <w:jc w:val="center"/>
+              <w:textAlignment w:val="baseline"/>
+              <w:rPr>
+                <w:rFonts w:ascii="Segoe UI" w:hAnsi="Segoe UI" w:cs="Segoe UI"/>
+                <w:b/>
+                <w:bCs/>
+                <w:color w:val="000000"/>
+                <w:sz w:val="18"/>
+                <w:szCs w:val="18"/>
+                <w:lang w:val="pt-PT" w:eastAsia="pt-PT"/>
+              </w:rPr>
+            </w:pPr>
+            <w:r>
+              <w:rPr>
+                <w:rFonts w:cs="Arial"/>
+                <w:b/>
+                <w:bCs/>
+                <w:color w:val="000000"/>
+                <w:szCs w:val="20"/>
+                <w:lang w:eastAsia="pt-PT"/>
+              </w:rPr>
+              <w:t>WP</w:t>
+            </w:r>
+            <w:r>
+              <w:rPr>
+                <w:rFonts w:cs="Arial"/>
+                <w:b/>
+                <w:bCs/>
+                <w:color w:val="000000"/>
+                <w:szCs w:val="20"/>
+                <w:lang w:val="pt-PT" w:eastAsia="pt-PT"/>
+              </w:rPr>
+              <w:t> </w:t>
+            </w:r>
+          </w:p>
+        </w:tc>
+        <w:tc>
+          <w:tcPr>
+            <w:tcW w:w="7215" w:type="dxa"/>
+            <w:tcBorders>
+              <w:top w:val="single" w:sz="6" w:space="0" w:color="4A442A"/>
+              <w:left w:val="single" w:sz="6" w:space="0" w:color="4A442A"/>
+              <w:bottom w:val="single" w:sz="6" w:space="0" w:color="4A442A"/>
+              <w:right w:val="single" w:sz="6" w:space="0" w:color="4A442A"/>
+            </w:tcBorders>
+            <w:shd w:val="clear" w:color="auto" w:fill="D6E3BC"/>
+            <w:vAlign w:val="center"/>
+            <w:hideMark/>
+          </w:tcPr>
+          <w:p>
+            <w:pPr>
+              <w:jc w:val="center"/>
+              <w:textAlignment w:val="baseline"/>
+              <w:rPr>
+                <w:rFonts w:ascii="Segoe UI" w:hAnsi="Segoe UI" w:cs="Segoe UI"/>
+                <w:b/>
+                <w:bCs/>
+                <w:color w:val="000000"/>
+                <w:sz w:val="18"/>
+                <w:szCs w:val="18"/>
+                <w:lang w:val="pt-PT" w:eastAsia="pt-PT"/>
+              </w:rPr>
+            </w:pPr>
+            <w:r>
+              <w:rPr>
+                <w:rFonts w:cs="Arial"/>
+                <w:b/>
+                <w:bCs/>
+                <w:color w:val="000000"/>
+                <w:szCs w:val="20"/>
+                <w:lang w:eastAsia="pt-PT"/>
+              </w:rPr>
+              <w:t>Contribution to Experiments/Demos</w:t>
+            </w:r>
+            <w:r>
+              <w:rPr>
+                <w:rFonts w:cs="Arial"/>
+                <w:b/>
+                <w:bCs/>
+                <w:color w:val="000000"/>
+                <w:szCs w:val="20"/>
+                <w:lang w:val="pt-PT" w:eastAsia="pt-PT"/>
+              </w:rPr>
+              <w:t> </w:t>
+            </w:r>
+          </w:p>
+        </w:tc>
+      </w:tr>
+      <w:tr>
+        <w:trPr>
+          <w:trHeight w:val="270"/>
+        </w:trPr>
+        <w:tc>
+          <w:tcPr>
+            <w:tcW w:w="2415" w:type="dxa"/>
+            <w:tcBorders>
+              <w:top w:val="single" w:sz="6" w:space="0" w:color="4A442A"/>
+              <w:left w:val="single" w:sz="6" w:space="0" w:color="4A442A"/>
+              <w:bottom w:val="single" w:sz="6" w:space="0" w:color="4A442A"/>
+              <w:right w:val="single" w:sz="6" w:space="0" w:color="4A442A"/>
+            </w:tcBorders>
+            <w:hideMark/>
+          </w:tcPr>
+          <w:p>
+            <w:pPr>
+              <w:textAlignment w:val="baseline"/>
+              <w:rPr>
+                <w:rFonts w:ascii="Segoe UI" w:hAnsi="Segoe UI" w:cs="Segoe UI"/>
+                <w:sz w:val="18"/>
+                <w:szCs w:val="18"/>
+                <w:lang w:val="pt-PT" w:eastAsia="pt-PT"/>
+              </w:rPr>
+            </w:pPr>
+            <w:r>
+              <w:rPr>
+                <w:rFonts w:cs="Arial"/>
+                <w:szCs w:val="20"/>
+                <w:lang w:eastAsia="pt-PT"/>
+              </w:rPr>
+              <w:t>WP1: Use cases description &amp; requirements</w:t>
+            </w:r>
+            <w:r>
+              <w:rPr>
+                <w:rFonts w:cs="Arial"/>
+                <w:szCs w:val="20"/>
+                <w:lang w:val="pt-PT" w:eastAsia="pt-PT"/>
+              </w:rPr>
+              <w:t> </w:t>
+            </w:r>
+          </w:p>
+        </w:tc>
+        <w:tc>
+          <w:tcPr>
+            <w:tcW w:w="7215" w:type="dxa"/>
+            <w:tcBorders>
+              <w:top w:val="single" w:sz="6" w:space="0" w:color="4A442A"/>
+              <w:left w:val="single" w:sz="6" w:space="0" w:color="4A442A"/>
+              <w:bottom w:val="single" w:sz="6" w:space="0" w:color="4A442A"/>
+              <w:right w:val="single" w:sz="6" w:space="0" w:color="4A442A"/>
+            </w:tcBorders>
+            <w:hideMark/>
+          </w:tcPr>
+          <w:p>
+            <w:pPr>
+              <w:jc w:val="both"/>
+              <w:textAlignment w:val="baseline"/>
+              <w:rPr>
+                <w:rFonts w:ascii="Segoe UI" w:hAnsi="Segoe UI" w:cs="Segoe UI"/>
+                <w:sz w:val="18"/>
+                <w:szCs w:val="18"/>
+                <w:lang w:val="pt-PT" w:eastAsia="pt-PT"/>
+              </w:rPr>
+            </w:pPr>
+            <w:r>
+              <w:rPr>
+                <w:rFonts w:cs="Arial"/>
+                <w:szCs w:val="20"/>
+                <w:lang w:eastAsia="pt-PT"/>
+              </w:rPr>
+              <w:t>Refined</w:t>
+            </w:r>
+            <w:r>
+              <w:rPr>
+                <w:rFonts w:cs="Arial"/>
+                <w:szCs w:val="20"/>
+                <w:lang w:eastAsia="pt-PT"/>
+              </w:rPr>
+              <w:t xml:space="preserve"> the operational context, technical needs, and evaluation criteria for the UC4 experiment and demos.</w:t>
+            </w:r>
+            <w:r>
+              <w:rPr>
+                <w:rFonts w:cs="Arial"/>
+                <w:szCs w:val="20"/>
+                <w:lang w:val="pt-PT" w:eastAsia="pt-PT"/>
+              </w:rPr>
+              <w:t> </w:t>
+            </w:r>
+          </w:p>
+        </w:tc>
+      </w:tr>
+      <w:tr>
+        <w:trPr>
+          <w:trHeight w:val="270"/>
+        </w:trPr>
+        <w:tc>
+          <w:tcPr>
+            <w:tcW w:w="2415" w:type="dxa"/>
+            <w:tcBorders>
+              <w:top w:val="single" w:sz="6" w:space="0" w:color="4A442A"/>
+              <w:left w:val="single" w:sz="6" w:space="0" w:color="4A442A"/>
+              <w:bottom w:val="single" w:sz="6" w:space="0" w:color="4A442A"/>
+              <w:right w:val="single" w:sz="6" w:space="0" w:color="4A442A"/>
+            </w:tcBorders>
+            <w:hideMark/>
+          </w:tcPr>
+          <w:p>
+            <w:pPr>
+              <w:textAlignment w:val="baseline"/>
+              <w:rPr>
+                <w:rFonts w:ascii="Segoe UI" w:hAnsi="Segoe UI" w:cs="Segoe UI"/>
+                <w:sz w:val="18"/>
+                <w:szCs w:val="18"/>
+                <w:lang w:val="pt-PT" w:eastAsia="pt-PT"/>
+              </w:rPr>
+            </w:pPr>
+            <w:r>
+              <w:rPr>
+                <w:rFonts w:cs="Arial"/>
+                <w:szCs w:val="20"/>
+                <w:lang w:eastAsia="pt-PT"/>
+              </w:rPr>
+              <w:t>WP 2: Sa4CPS concept architecture</w:t>
+            </w:r>
+            <w:r>
+              <w:rPr>
+                <w:rFonts w:cs="Arial"/>
+                <w:szCs w:val="20"/>
+                <w:lang w:val="pt-PT" w:eastAsia="pt-PT"/>
+              </w:rPr>
+              <w:t> </w:t>
+            </w:r>
+          </w:p>
+        </w:tc>
+        <w:tc>
+          <w:tcPr>
+            <w:tcW w:w="7215" w:type="dxa"/>
+            <w:tcBorders>
+              <w:top w:val="single" w:sz="6" w:space="0" w:color="4A442A"/>
+              <w:left w:val="single" w:sz="6" w:space="0" w:color="4A442A"/>
+              <w:bottom w:val="single" w:sz="6" w:space="0" w:color="4A442A"/>
+              <w:right w:val="single" w:sz="6" w:space="0" w:color="4A442A"/>
+            </w:tcBorders>
+            <w:hideMark/>
+          </w:tcPr>
+          <w:p>
+            <w:pPr>
+              <w:jc w:val="both"/>
+              <w:textAlignment w:val="baseline"/>
+              <w:rPr>
+                <w:rFonts w:ascii="Segoe UI" w:hAnsi="Segoe UI" w:cs="Segoe UI"/>
+                <w:sz w:val="18"/>
+                <w:szCs w:val="18"/>
+                <w:lang w:val="pt-PT" w:eastAsia="pt-PT"/>
+              </w:rPr>
+            </w:pPr>
+            <w:r>
+              <w:rPr>
+                <w:rFonts w:cs="Arial"/>
+                <w:szCs w:val="20"/>
+                <w:lang w:eastAsia="pt-PT"/>
+              </w:rPr>
+              <w:t xml:space="preserve">Provided the overall system architecture that supports integration of various components such metering infrastructure, energy management services, and </w:t>
+            </w:r>
+            <w:r>
+              <w:rPr>
+                <w:rFonts w:cs="Arial"/>
+                <w:szCs w:val="20"/>
+                <w:lang w:eastAsia="pt-PT"/>
+              </w:rPr>
+              <w:t>the energy community software infrastructure</w:t>
+            </w:r>
+            <w:r>
+              <w:rPr>
+                <w:rFonts w:cs="Arial"/>
+                <w:szCs w:val="20"/>
+                <w:lang w:eastAsia="pt-PT"/>
+              </w:rPr>
+              <w:t>.</w:t>
+            </w:r>
+            <w:r>
+              <w:rPr>
+                <w:rFonts w:cs="Arial"/>
+                <w:szCs w:val="20"/>
+                <w:lang w:val="pt-PT" w:eastAsia="pt-PT"/>
+              </w:rPr>
+              <w:t> </w:t>
+            </w:r>
+          </w:p>
+        </w:tc>
+      </w:tr>
+      <w:tr>
+        <w:trPr>
+          <w:trHeight w:val="270"/>
+        </w:trPr>
+        <w:tc>
+          <w:tcPr>
+            <w:tcW w:w="2415" w:type="dxa"/>
+            <w:tcBorders>
+              <w:top w:val="single" w:sz="6" w:space="0" w:color="4A442A"/>
+              <w:left w:val="single" w:sz="6" w:space="0" w:color="4A442A"/>
+              <w:bottom w:val="single" w:sz="6" w:space="0" w:color="4A442A"/>
+              <w:right w:val="single" w:sz="6" w:space="0" w:color="4A442A"/>
+            </w:tcBorders>
+            <w:hideMark/>
+          </w:tcPr>
+          <w:p>
+            <w:pPr>
+              <w:textAlignment w:val="baseline"/>
+              <w:rPr>
+                <w:rFonts w:ascii="Segoe UI" w:hAnsi="Segoe UI" w:cs="Segoe UI"/>
+                <w:sz w:val="18"/>
+                <w:szCs w:val="18"/>
+                <w:lang w:val="pt-PT" w:eastAsia="pt-PT"/>
+              </w:rPr>
+            </w:pPr>
+            <w:r>
+              <w:rPr>
+                <w:rFonts w:cs="Arial"/>
+                <w:szCs w:val="20"/>
+                <w:lang w:eastAsia="pt-PT"/>
+              </w:rPr>
+              <w:t>WP 3: Perception &amp; Comprehension</w:t>
+            </w:r>
+            <w:r>
+              <w:rPr>
+                <w:rFonts w:cs="Arial"/>
+                <w:szCs w:val="20"/>
+                <w:lang w:val="pt-PT" w:eastAsia="pt-PT"/>
+              </w:rPr>
+              <w:t> </w:t>
+            </w:r>
+          </w:p>
+        </w:tc>
+        <w:tc>
+          <w:tcPr>
+            <w:tcW w:w="7215" w:type="dxa"/>
+            <w:tcBorders>
+              <w:top w:val="single" w:sz="6" w:space="0" w:color="4A442A"/>
+              <w:left w:val="single" w:sz="6" w:space="0" w:color="4A442A"/>
+              <w:bottom w:val="single" w:sz="6" w:space="0" w:color="4A442A"/>
+              <w:right w:val="single" w:sz="6" w:space="0" w:color="4A442A"/>
+            </w:tcBorders>
+            <w:hideMark/>
+          </w:tcPr>
+          <w:p>
+            <w:pPr>
+              <w:jc w:val="both"/>
+              <w:textAlignment w:val="baseline"/>
+              <w:rPr>
+                <w:rFonts w:ascii="Segoe UI" w:hAnsi="Segoe UI" w:cs="Segoe UI"/>
+                <w:sz w:val="18"/>
+                <w:szCs w:val="18"/>
+                <w:lang w:val="pt-PT" w:eastAsia="pt-PT"/>
+              </w:rPr>
+            </w:pPr>
+            <w:r>
+              <w:rPr>
+                <w:rFonts w:cs="Arial"/>
+                <w:szCs w:val="20"/>
+                <w:lang w:eastAsia="pt-PT"/>
+              </w:rPr>
+              <w:t>Supported to creating an area where data that can be used in AI techniques can be visualized.</w:t>
+            </w:r>
+            <w:r>
+              <w:rPr>
+                <w:rFonts w:cs="Arial"/>
+                <w:szCs w:val="20"/>
+                <w:lang w:val="pt-PT" w:eastAsia="pt-PT"/>
+              </w:rPr>
+              <w:t> </w:t>
+            </w:r>
+          </w:p>
+        </w:tc>
+      </w:tr>
+      <w:tr>
+        <w:trPr>
+          <w:trHeight w:val="270"/>
+        </w:trPr>
+        <w:tc>
+          <w:tcPr>
+            <w:tcW w:w="2415" w:type="dxa"/>
+            <w:tcBorders>
+              <w:top w:val="single" w:sz="6" w:space="0" w:color="4A442A"/>
+              <w:left w:val="single" w:sz="6" w:space="0" w:color="4A442A"/>
+              <w:bottom w:val="single" w:sz="6" w:space="0" w:color="4A442A"/>
+              <w:right w:val="single" w:sz="6" w:space="0" w:color="4A442A"/>
+            </w:tcBorders>
+            <w:hideMark/>
+          </w:tcPr>
+          <w:p>
+            <w:pPr>
+              <w:textAlignment w:val="baseline"/>
+              <w:rPr>
+                <w:rFonts w:ascii="Segoe UI" w:hAnsi="Segoe UI" w:cs="Segoe UI"/>
+                <w:sz w:val="18"/>
+                <w:szCs w:val="18"/>
+                <w:lang w:val="pt-PT" w:eastAsia="pt-PT"/>
+              </w:rPr>
+            </w:pPr>
+            <w:r>
+              <w:rPr>
+                <w:rFonts w:cs="Arial"/>
+                <w:szCs w:val="20"/>
+                <w:lang w:eastAsia="pt-PT"/>
+              </w:rPr>
+              <w:t>WP 4: Status, Projections &amp; Actions</w:t>
+            </w:r>
+            <w:r>
+              <w:rPr>
+                <w:rFonts w:cs="Arial"/>
+                <w:szCs w:val="20"/>
+                <w:lang w:val="pt-PT" w:eastAsia="pt-PT"/>
+              </w:rPr>
+              <w:t> </w:t>
+            </w:r>
+          </w:p>
+        </w:tc>
+        <w:tc>
+          <w:tcPr>
+            <w:tcW w:w="7215" w:type="dxa"/>
+            <w:tcBorders>
+              <w:top w:val="single" w:sz="6" w:space="0" w:color="4A442A"/>
+              <w:left w:val="single" w:sz="6" w:space="0" w:color="4A442A"/>
+              <w:bottom w:val="single" w:sz="6" w:space="0" w:color="4A442A"/>
+              <w:right w:val="single" w:sz="6" w:space="0" w:color="4A442A"/>
+            </w:tcBorders>
+            <w:hideMark/>
+          </w:tcPr>
+          <w:p>
+            <w:pPr>
+              <w:jc w:val="both"/>
+              <w:textAlignment w:val="baseline"/>
+              <w:rPr>
+                <w:rFonts w:ascii="Segoe UI" w:hAnsi="Segoe UI" w:cs="Segoe UI"/>
+                <w:sz w:val="18"/>
+                <w:szCs w:val="18"/>
+                <w:lang w:val="pt-PT" w:eastAsia="pt-PT"/>
+              </w:rPr>
+            </w:pPr>
+            <w:r>
+              <w:rPr>
+                <w:rFonts w:cs="Arial"/>
+                <w:szCs w:val="20"/>
+                <w:lang w:eastAsia="pt-PT"/>
+              </w:rPr>
+              <w:t>Contributed real-time dashboards, and status visualization tools used for energy </w:t>
+            </w:r>
+            <w:proofErr w:type="gramStart"/>
+            <w:r>
+              <w:rPr>
+                <w:rFonts w:cs="Arial"/>
+                <w:szCs w:val="20"/>
+                <w:lang w:eastAsia="pt-PT"/>
+              </w:rPr>
+              <w:t>communities</w:t>
+            </w:r>
+            <w:proofErr w:type="gramEnd"/>
+            <w:r>
+              <w:rPr>
+                <w:rFonts w:cs="Arial"/>
+                <w:szCs w:val="20"/>
+                <w:lang w:eastAsia="pt-PT"/>
+              </w:rPr>
+              <w:t> management.</w:t>
+            </w:r>
+            <w:r>
+              <w:rPr>
+                <w:rFonts w:cs="Arial"/>
+                <w:szCs w:val="20"/>
+                <w:lang w:val="pt-PT" w:eastAsia="pt-PT"/>
+              </w:rPr>
+              <w:t> </w:t>
+            </w:r>
+          </w:p>
+        </w:tc>
+      </w:tr>
+      <w:tr>
+        <w:trPr>
+          <w:trHeight w:val="270"/>
+        </w:trPr>
+        <w:tc>
+          <w:tcPr>
+            <w:tcW w:w="2415" w:type="dxa"/>
+            <w:tcBorders>
+              <w:top w:val="single" w:sz="6" w:space="0" w:color="4A442A"/>
+              <w:left w:val="single" w:sz="6" w:space="0" w:color="4A442A"/>
+              <w:bottom w:val="single" w:sz="6" w:space="0" w:color="4A442A"/>
+              <w:right w:val="single" w:sz="6" w:space="0" w:color="4A442A"/>
+            </w:tcBorders>
+            <w:hideMark/>
+          </w:tcPr>
+          <w:p>
+            <w:pPr>
+              <w:textAlignment w:val="baseline"/>
+              <w:rPr>
+                <w:rFonts w:ascii="Segoe UI" w:hAnsi="Segoe UI" w:cs="Segoe UI"/>
+                <w:sz w:val="18"/>
+                <w:szCs w:val="18"/>
+                <w:lang w:val="pt-PT" w:eastAsia="pt-PT"/>
+              </w:rPr>
+            </w:pPr>
+            <w:r>
+              <w:rPr>
+                <w:rFonts w:cs="Arial"/>
+                <w:szCs w:val="20"/>
+                <w:lang w:eastAsia="pt-PT"/>
+              </w:rPr>
+              <w:lastRenderedPageBreak/>
+              <w:t>WP 5: Trust, security &amp; privacy for resilience</w:t>
+            </w:r>
+            <w:r>
+              <w:rPr>
+                <w:rFonts w:cs="Arial"/>
+                <w:szCs w:val="20"/>
+                <w:lang w:val="pt-PT" w:eastAsia="pt-PT"/>
+              </w:rPr>
+              <w:t> </w:t>
+            </w:r>
+          </w:p>
+        </w:tc>
+        <w:tc>
+          <w:tcPr>
+            <w:tcW w:w="7215" w:type="dxa"/>
+            <w:tcBorders>
+              <w:top w:val="single" w:sz="6" w:space="0" w:color="4A442A"/>
+              <w:left w:val="single" w:sz="6" w:space="0" w:color="4A442A"/>
+              <w:bottom w:val="single" w:sz="6" w:space="0" w:color="4A442A"/>
+              <w:right w:val="single" w:sz="6" w:space="0" w:color="4A442A"/>
+            </w:tcBorders>
+            <w:hideMark/>
+          </w:tcPr>
+          <w:p>
+            <w:pPr>
+              <w:jc w:val="both"/>
+              <w:textAlignment w:val="baseline"/>
+              <w:rPr>
+                <w:rFonts w:ascii="Segoe UI" w:hAnsi="Segoe UI" w:cs="Segoe UI"/>
+                <w:sz w:val="18"/>
+                <w:szCs w:val="18"/>
+                <w:lang w:val="pt-PT" w:eastAsia="pt-PT"/>
+              </w:rPr>
+            </w:pPr>
+            <w:r>
+              <w:rPr>
+                <w:rFonts w:cs="Arial"/>
+                <w:szCs w:val="20"/>
+                <w:lang w:eastAsia="pt-PT"/>
+              </w:rPr>
+              <w:t>Contributed to the security and privacy of the overall system architecture, by implementing encrypted communication between community nodes</w:t>
+            </w:r>
+          </w:p>
+        </w:tc>
+      </w:tr>
+    </w:tbl>
+    <w:p>
+      <w:pPr>
+        <w:rPr>
+          <w:lang w:val="en-US"/>
+        </w:rPr>
+      </w:pPr>
+    </w:p>
+    <w:p>
+      <w:pPr>
         <w:rPr>
           <w:lang w:val="en-US"/>
         </w:rPr>
@@ -15168,7 +15816,6 @@
                 <w:szCs w:val="21"/>
                 <w:lang w:eastAsia="en-US"/>
               </w:rPr>
-              <w:lastRenderedPageBreak/>
               <w:t>Average duration of line capacity issues (min)</w:t>
             </w:r>
           </w:p>
@@ -16460,7 +17107,6 @@
                 <w:szCs w:val="21"/>
                 <w:lang w:eastAsia="en-US"/>
               </w:rPr>
-              <w:lastRenderedPageBreak/>
               <w:t xml:space="preserve">Working prototype for </w:t>
             </w:r>
             <w:proofErr w:type="spellStart"/>
@@ -17150,7 +17796,16 @@
                 <w:szCs w:val="21"/>
                 <w:lang w:eastAsia="en-US"/>
               </w:rPr>
-              <w:t>, 3 = data used as system, 4 = system used in other Sa4CPS party / demo, 5 = data / system used by externals / commercial ready status)</w:t>
+              <w:t xml:space="preserve">, 3 = data used as system, 4 = system used in other Sa4CPS party / demo, </w:t>
+            </w:r>
+            <w:r>
+              <w:rPr>
+                <w:rFonts w:ascii="Calibri" w:hAnsi="Calibri"/>
+                <w:szCs w:val="21"/>
+                <w:lang w:eastAsia="en-US"/>
+              </w:rPr>
+              <w:lastRenderedPageBreak/>
+              <w:t>5 = data / system used by externals / commercial ready status)</w:t>
             </w:r>
           </w:p>
         </w:tc>
@@ -17172,6 +17827,7 @@
                 <w:szCs w:val="21"/>
                 <w:lang w:eastAsia="en-US"/>
               </w:rPr>
+              <w:lastRenderedPageBreak/>
               <w:t>0</w:t>
             </w:r>
           </w:p>
@@ -17547,7 +18203,6 @@
                 <w:szCs w:val="21"/>
                 <w:lang w:eastAsia="en-US"/>
               </w:rPr>
-              <w:lastRenderedPageBreak/>
               <w:t>Defining users, setting goals, choosing content and plans</w:t>
             </w:r>
           </w:p>
@@ -17570,7 +18225,6 @@
                 <w:szCs w:val="21"/>
                 <w:lang w:eastAsia="en-US"/>
               </w:rPr>
-              <w:lastRenderedPageBreak/>
               <w:t>0</w:t>
             </w:r>
           </w:p>
@@ -18078,6 +18732,7 @@
         <w:pStyle w:val="Ttulo3"/>
       </w:pPr>
       <w:r>
+        <w:lastRenderedPageBreak/>
         <w:t>Discussion and estimation of the targeted KPI</w:t>
       </w:r>
     </w:p>
@@ -18367,8 +19022,22 @@
                 <w:szCs w:val="21"/>
                 <w:lang w:eastAsia="en-US"/>
               </w:rPr>
-              <w:t xml:space="preserve"># Incident per 100 flights - incidents are any unwanted occurrences that could </w:t>
-            </w:r>
+              <w:t xml:space="preserve"># Incident per 100 flights - incidents are any unwanted occurrences that could have a negative impact on the safety of a flight operation. All incidents in our flight operations are recorded, so we will be able to precisely determine if there is an improvement. </w:t>
+            </w:r>
+          </w:p>
+        </w:tc>
+        <w:tc>
+          <w:tcPr>
+            <w:tcW w:w="344" w:type="dxa"/>
+          </w:tcPr>
+          <w:p>
+            <w:pPr>
+              <w:rPr>
+                <w:rFonts w:ascii="Calibri" w:hAnsi="Calibri"/>
+                <w:szCs w:val="21"/>
+                <w:lang w:eastAsia="en-US"/>
+              </w:rPr>
+            </w:pPr>
             <w:r>
               <w:rPr>
                 <w:rFonts w:ascii="Calibri" w:hAnsi="Calibri"/>
@@ -18376,14 +19045,13 @@
                 <w:szCs w:val="21"/>
                 <w:lang w:eastAsia="en-US"/>
               </w:rPr>
-              <w:lastRenderedPageBreak/>
-              <w:t xml:space="preserve">have a negative impact on the safety of a flight operation. All incidents in our flight operations are recorded, so we will be able to precisely determine if there is an improvement. </w:t>
-            </w:r>
-          </w:p>
-        </w:tc>
-        <w:tc>
-          <w:tcPr>
-            <w:tcW w:w="344" w:type="dxa"/>
+              <w:t>Current estimation: around 10 per hundred flights</w:t>
+            </w:r>
+          </w:p>
+        </w:tc>
+        <w:tc>
+          <w:tcPr>
+            <w:tcW w:w="2774" w:type="dxa"/>
           </w:tcPr>
           <w:p>
             <w:pPr>
@@ -18400,9 +19068,22 @@
                 <w:szCs w:val="21"/>
                 <w:lang w:eastAsia="en-US"/>
               </w:rPr>
-              <w:lastRenderedPageBreak/>
-              <w:t xml:space="preserve">Current estimation: </w:t>
-            </w:r>
+              <w:t>There is a high variability to such measures, and they depend on more factors than the quality of the developed situational awareness platform. However, the first measure has a direct impact on ADLC’s financial viability, and it will only be possible to increase it if it coincides with a decrease of the second.</w:t>
+            </w:r>
+          </w:p>
+        </w:tc>
+        <w:tc>
+          <w:tcPr>
+            <w:tcW w:w="1418" w:type="dxa"/>
+          </w:tcPr>
+          <w:p>
+            <w:pPr>
+              <w:rPr>
+                <w:rFonts w:ascii="Calibri" w:hAnsi="Calibri"/>
+                <w:szCs w:val="21"/>
+                <w:lang w:eastAsia="en-US"/>
+              </w:rPr>
+            </w:pPr>
             <w:r>
               <w:rPr>
                 <w:rFonts w:ascii="Calibri" w:hAnsi="Calibri"/>
@@ -18410,76 +19091,7 @@
                 <w:szCs w:val="21"/>
                 <w:lang w:eastAsia="en-US"/>
               </w:rPr>
-              <w:lastRenderedPageBreak/>
-              <w:t>around 10 per hundred flights</w:t>
-            </w:r>
-          </w:p>
-        </w:tc>
-        <w:tc>
-          <w:tcPr>
-            <w:tcW w:w="2774" w:type="dxa"/>
-          </w:tcPr>
-          <w:p>
-            <w:pPr>
-              <w:rPr>
-                <w:rFonts w:ascii="Calibri" w:hAnsi="Calibri"/>
-                <w:szCs w:val="21"/>
-                <w:lang w:eastAsia="en-US"/>
-              </w:rPr>
-            </w:pPr>
-            <w:r>
-              <w:rPr>
-                <w:rFonts w:ascii="Calibri" w:hAnsi="Calibri"/>
-                <w:spacing w:val="4"/>
-                <w:szCs w:val="21"/>
-                <w:lang w:eastAsia="en-US"/>
-              </w:rPr>
-              <w:lastRenderedPageBreak/>
-              <w:t xml:space="preserve">There is a high variability to such </w:t>
-            </w:r>
-            <w:r>
-              <w:rPr>
-                <w:rFonts w:ascii="Calibri" w:hAnsi="Calibri"/>
-                <w:spacing w:val="4"/>
-                <w:szCs w:val="21"/>
-                <w:lang w:eastAsia="en-US"/>
-              </w:rPr>
-              <w:lastRenderedPageBreak/>
-              <w:t>measures, and they depend on more factors than the quality of the developed situational awareness platform. However, the first measure has a direct impact on ADLC’s financial viability, and it will only be possible to increase it if it coincides with a decrease of the second.</w:t>
-            </w:r>
-          </w:p>
-        </w:tc>
-        <w:tc>
-          <w:tcPr>
-            <w:tcW w:w="1418" w:type="dxa"/>
-          </w:tcPr>
-          <w:p>
-            <w:pPr>
-              <w:rPr>
-                <w:rFonts w:ascii="Calibri" w:hAnsi="Calibri"/>
-                <w:szCs w:val="21"/>
-                <w:lang w:eastAsia="en-US"/>
-              </w:rPr>
-            </w:pPr>
-            <w:r>
-              <w:rPr>
-                <w:rFonts w:ascii="Calibri" w:hAnsi="Calibri"/>
-                <w:spacing w:val="4"/>
-                <w:szCs w:val="21"/>
-                <w:lang w:eastAsia="en-US"/>
-              </w:rPr>
-              <w:lastRenderedPageBreak/>
-              <w:t xml:space="preserve">Current estimation: </w:t>
-            </w:r>
-            <w:r>
-              <w:rPr>
-                <w:rFonts w:ascii="Calibri" w:hAnsi="Calibri"/>
-                <w:spacing w:val="4"/>
-                <w:szCs w:val="21"/>
-                <w:lang w:eastAsia="en-US"/>
-              </w:rPr>
-              <w:lastRenderedPageBreak/>
-              <w:t>around 10 per hundred flights</w:t>
+              <w:t>Current estimation: around 10 per hundred flights</w:t>
             </w:r>
             <w:r>
               <w:rPr>
@@ -18521,7 +19133,6 @@
                 <w:szCs w:val="21"/>
                 <w:lang w:eastAsia="en-US"/>
               </w:rPr>
-              <w:lastRenderedPageBreak/>
               <w:t>Time to respond to incidents. Generally, faster response prevent escalation</w:t>
             </w:r>
           </w:p>
@@ -18732,6 +19343,7 @@
           <w:szCs w:val="20"/>
           <w:lang w:val="en-US" w:eastAsia="en-US"/>
         </w:rPr>
+        <w:lastRenderedPageBreak/>
         <w:t>KPI :</w:t>
       </w:r>
       <w:proofErr w:type="gramEnd"/>
@@ -18900,8 +19512,9 @@
                 <w:szCs w:val="21"/>
                 <w:lang w:eastAsia="en-US"/>
               </w:rPr>
-              <w:t xml:space="preserve">Update of the Capture server software and Capture edge and industrial device control software and parameters can be realized in a secured way. This means all measures are taken to ensure a safe state in which updates, validation and rollback is possible in case of detected problems. The validation of correct behaviour must be possible by comparing in real-time the physical behaviour to the simulated Digital Twin behaviour, while ensuring no </w:t>
-            </w:r>
+              <w:t xml:space="preserve">Update of the Capture server software and Capture edge and industrial device control software and parameters can be realized in a secured way. This means all measures are taken to ensure a safe state in which updates, validation and rollback is possible in case of detected problems. The validation of correct behaviour must be possible by comparing in real-time the physical behaviour to the simulated Digital Twin behaviour, while ensuring no physical harm can be done by unexpected actions. The measurable indicator is the demonstration of such update scenarios in </w:t>
+            </w:r>
+            <w:proofErr w:type="spellStart"/>
             <w:r>
               <w:rPr>
                 <w:rFonts w:ascii="Calibri" w:hAnsi="Calibri"/>
@@ -18909,10 +19522,9 @@
                 <w:szCs w:val="21"/>
                 <w:lang w:eastAsia="en-US"/>
               </w:rPr>
-              <w:lastRenderedPageBreak/>
-              <w:t xml:space="preserve">physical harm can be done by unexpected actions. The measurable indicator is the demonstration of such update scenarios in </w:t>
-            </w:r>
-            <w:proofErr w:type="spellStart"/>
+              <w:t>Vintecc</w:t>
+            </w:r>
+            <w:proofErr w:type="spellEnd"/>
             <w:r>
               <w:rPr>
                 <w:rFonts w:ascii="Calibri" w:hAnsi="Calibri"/>
@@ -18920,9 +19532,22 @@
                 <w:szCs w:val="21"/>
                 <w:lang w:eastAsia="en-US"/>
               </w:rPr>
-              <w:t>Vintecc</w:t>
-            </w:r>
-            <w:proofErr w:type="spellEnd"/>
+              <w:t xml:space="preserve"> lab environment open to the critical remarks and investigation by the consortium partners.</w:t>
+            </w:r>
+          </w:p>
+        </w:tc>
+        <w:tc>
+          <w:tcPr>
+            <w:tcW w:w="1606" w:type="dxa"/>
+          </w:tcPr>
+          <w:p>
+            <w:pPr>
+              <w:rPr>
+                <w:rFonts w:ascii="Calibri" w:hAnsi="Calibri"/>
+                <w:szCs w:val="21"/>
+                <w:lang w:eastAsia="en-US"/>
+              </w:rPr>
+            </w:pPr>
             <w:r>
               <w:rPr>
                 <w:rFonts w:ascii="Calibri" w:hAnsi="Calibri"/>
@@ -18930,13 +19555,13 @@
                 <w:szCs w:val="21"/>
                 <w:lang w:eastAsia="en-US"/>
               </w:rPr>
-              <w:t xml:space="preserve"> lab environment open to the critical remarks and investigation by the consortium partners.</w:t>
-            </w:r>
-          </w:p>
-        </w:tc>
-        <w:tc>
-          <w:tcPr>
-            <w:tcW w:w="1606" w:type="dxa"/>
+              <w:t>Capture Edge and other edge software can be updated in a Linux and Windows environment, but not in a Docker environment. Validation and rollbacks are done manually.</w:t>
+            </w:r>
+          </w:p>
+        </w:tc>
+        <w:tc>
+          <w:tcPr>
+            <w:tcW w:w="2520" w:type="dxa"/>
           </w:tcPr>
           <w:p>
             <w:pPr>
@@ -18953,41 +19578,6 @@
                 <w:szCs w:val="21"/>
                 <w:lang w:eastAsia="en-US"/>
               </w:rPr>
-              <w:lastRenderedPageBreak/>
-              <w:t xml:space="preserve">Capture Edge and other edge software can be updated in a Linux and Windows environment, but not in a Docker environment. Validation and rollbacks are </w:t>
-            </w:r>
-            <w:r>
-              <w:rPr>
-                <w:rFonts w:ascii="Calibri" w:hAnsi="Calibri"/>
-                <w:spacing w:val="4"/>
-                <w:szCs w:val="21"/>
-                <w:lang w:eastAsia="en-US"/>
-              </w:rPr>
-              <w:lastRenderedPageBreak/>
-              <w:t>done manually.</w:t>
-            </w:r>
-          </w:p>
-        </w:tc>
-        <w:tc>
-          <w:tcPr>
-            <w:tcW w:w="2520" w:type="dxa"/>
-          </w:tcPr>
-          <w:p>
-            <w:pPr>
-              <w:rPr>
-                <w:rFonts w:ascii="Calibri" w:hAnsi="Calibri"/>
-                <w:szCs w:val="21"/>
-                <w:lang w:eastAsia="en-US"/>
-              </w:rPr>
-            </w:pPr>
-            <w:r>
-              <w:rPr>
-                <w:rFonts w:ascii="Calibri" w:hAnsi="Calibri"/>
-                <w:spacing w:val="4"/>
-                <w:szCs w:val="21"/>
-                <w:lang w:eastAsia="en-US"/>
-              </w:rPr>
-              <w:lastRenderedPageBreak/>
               <w:t>We demonstrate we can update Capture Edge and other edge software in a container environment in a safe manner.</w:t>
             </w:r>
           </w:p>
@@ -19188,7 +19778,17 @@
                 <w:szCs w:val="21"/>
                 <w:lang w:eastAsia="en-US"/>
               </w:rPr>
-              <w:t xml:space="preserve"> will define a strategy to continuously maximise its software protection against new cyber security dangers threats to be able to ensure its customers on building and maintaining safe and reliable solutions.</w:t>
+              <w:t xml:space="preserve"> will define a strategy to continuously maximise its software protection against new cyber security dangers threats to be able to ensure its customers on building </w:t>
+            </w:r>
+            <w:r>
+              <w:rPr>
+                <w:rFonts w:ascii="Calibri" w:hAnsi="Calibri"/>
+                <w:spacing w:val="4"/>
+                <w:szCs w:val="21"/>
+                <w:lang w:eastAsia="en-US"/>
+              </w:rPr>
+              <w:lastRenderedPageBreak/>
+              <w:t>and maintaining safe and reliable solutions.</w:t>
             </w:r>
           </w:p>
         </w:tc>
@@ -19212,7 +19812,18 @@
                 <w:szCs w:val="21"/>
                 <w:lang w:eastAsia="en-US"/>
               </w:rPr>
-              <w:t>We don’t have a general strategy to keep edge devices up to date and secure, these are done case by case.</w:t>
+              <w:lastRenderedPageBreak/>
+              <w:t xml:space="preserve">We don’t have a general strategy to keep edge devices up to date and secure, these </w:t>
+            </w:r>
+            <w:r>
+              <w:rPr>
+                <w:rFonts w:ascii="Calibri" w:hAnsi="Calibri"/>
+                <w:spacing w:val="4"/>
+                <w:szCs w:val="21"/>
+                <w:lang w:eastAsia="en-US"/>
+              </w:rPr>
+              <w:lastRenderedPageBreak/>
+              <w:t>are done case by case.</w:t>
             </w:r>
           </w:p>
         </w:tc>
@@ -19236,6 +19847,7 @@
                 <w:szCs w:val="21"/>
                 <w:lang w:eastAsia="en-US"/>
               </w:rPr>
+              <w:lastRenderedPageBreak/>
               <w:t>We have a general strategy to keep edge devices up to date and secure.</w:t>
             </w:r>
           </w:p>
@@ -19258,7 +19870,16 @@
                 <w:szCs w:val="21"/>
                 <w:lang w:eastAsia="en-US"/>
               </w:rPr>
-              <w:t xml:space="preserve">Security issues have been identified. Work has started to handle these issues. </w:t>
+              <w:t xml:space="preserve">Security issues have been identified. Work has started to </w:t>
+            </w:r>
+            <w:r>
+              <w:rPr>
+                <w:rFonts w:ascii="Calibri" w:hAnsi="Calibri"/>
+                <w:szCs w:val="21"/>
+                <w:lang w:eastAsia="en-US"/>
+              </w:rPr>
+              <w:lastRenderedPageBreak/>
+              <w:t xml:space="preserve">handle these issues. </w:t>
             </w:r>
             <w:r>
               <w:rPr>
@@ -19300,6 +19921,7 @@
                 <w:szCs w:val="21"/>
                 <w:lang w:eastAsia="en-US"/>
               </w:rPr>
+              <w:lastRenderedPageBreak/>
               <w:t>Vintecc</w:t>
             </w:r>
             <w:proofErr w:type="spellEnd"/>
@@ -19334,41 +19956,30 @@
                 <w:szCs w:val="21"/>
                 <w:lang w:eastAsia="en-US"/>
               </w:rPr>
-              <w:t xml:space="preserve">Edge updating is possible for Linux and Windows devices from the Capture cloud portal. This is not possible for container environments. We don’t have a mechanism that clearly indicates to the user when </w:t>
-            </w:r>
-            <w:r>
+              <w:t>Edge updating is possible for Linux and Windows devices from the Capture cloud portal. This is not possible for container environments. We don’t have a mechanism that clearly indicates to the user when an update is required for security reasons.</w:t>
+            </w:r>
+          </w:p>
+        </w:tc>
+        <w:tc>
+          <w:tcPr>
+            <w:tcW w:w="2520" w:type="dxa"/>
+          </w:tcPr>
+          <w:p>
+            <w:pPr>
               <w:rPr>
                 <w:rFonts w:ascii="Calibri" w:hAnsi="Calibri"/>
                 <w:spacing w:val="4"/>
                 <w:szCs w:val="21"/>
                 <w:lang w:eastAsia="en-US"/>
               </w:rPr>
-              <w:lastRenderedPageBreak/>
-              <w:t>an update is required for security reasons.</w:t>
-            </w:r>
-          </w:p>
-        </w:tc>
-        <w:tc>
-          <w:tcPr>
-            <w:tcW w:w="2520" w:type="dxa"/>
-          </w:tcPr>
-          <w:p>
-            <w:pPr>
+            </w:pPr>
+            <w:r>
               <w:rPr>
                 <w:rFonts w:ascii="Calibri" w:hAnsi="Calibri"/>
                 <w:spacing w:val="4"/>
                 <w:szCs w:val="21"/>
                 <w:lang w:eastAsia="en-US"/>
               </w:rPr>
-            </w:pPr>
-            <w:r>
-              <w:rPr>
-                <w:rFonts w:ascii="Calibri" w:hAnsi="Calibri"/>
-                <w:spacing w:val="4"/>
-                <w:szCs w:val="21"/>
-                <w:lang w:eastAsia="en-US"/>
-              </w:rPr>
-              <w:lastRenderedPageBreak/>
               <w:t>A user can update Capture Edge on all environments from the Capture portal. It is easy for the user to detect required updates, trigger the update and validate the results.</w:t>
             </w:r>
           </w:p>
@@ -19551,6 +20162,7 @@
         <w:jc w:val="both"/>
       </w:pPr>
       <w:r>
+        <w:lastRenderedPageBreak/>
         <w:t>The 5G communication dimension will also be linked to the integrated scenario. Wi-Fi and 5G communication statuses will be simulated in the digital twin environment. The demonstration will show Wi-Fi connection loss, activation of the backup 5G communication path and visualization of the active communication source. In this way, it will be demonstrated that situational awareness can be maintained even when communication conditions change.</w:t>
       </w:r>
     </w:p>
@@ -20009,7 +20621,6 @@
           <w:b/>
           <w:bCs/>
         </w:rPr>
-        <w:lastRenderedPageBreak/>
         <w:t>Partner contribution:</w:t>
       </w:r>
       <w:r>
@@ -20227,6 +20838,7 @@
             <w:sz w:val="19"/>
             <w:szCs w:val="19"/>
           </w:rPr>
+          <w:lastRenderedPageBreak/>
           <w:t>In the fourth stage, a fleet utilisation plan is presented showing vehicle capacity allocation across the optimised routes. Fully utilised vehicles and low-efficiency outliers are highlighted, and a concrete consolidation recommendation derived from the analysis is shown, including estimated annual distance reduction.</w:t>
         </w:r>
       </w:ins>
@@ -20555,7 +21167,6 @@
         <w:pStyle w:val="Corpodetexto"/>
       </w:pPr>
       <w:r>
-        <w:lastRenderedPageBreak/>
         <w:t xml:space="preserve">            </w:t>
       </w:r>
       <w:r>
@@ -20723,7 +21334,16 @@
           <w:sz w:val="24"/>
           <w:lang w:val="en-US"/>
         </w:rPr>
-        <w:t xml:space="preserve">ramework to measure firefighters’ biosignals during the rescue operation or similar events. The captured data will be streamed to cloud-based dashboards using the secure data synchronization pipeline. The system consists of the following sub-systems: </w:t>
+        <w:t xml:space="preserve">ramework to measure firefighters’ biosignals during the rescue operation or similar events. The captured data will be streamed </w:t>
+      </w:r>
+      <w:r>
+        <w:rPr>
+          <w:rFonts w:ascii="Aptos" w:eastAsia="Aptos" w:hAnsi="Aptos" w:cs="Aptos"/>
+          <w:sz w:val="24"/>
+          <w:lang w:val="en-US"/>
+        </w:rPr>
+        <w:lastRenderedPageBreak/>
+        <w:t xml:space="preserve">to cloud-based dashboards using the secure data synchronization pipeline. The system consists of the following sub-systems: </w:t>
       </w:r>
     </w:p>
     <w:p>
@@ -20886,7 +21506,6 @@
           <w:szCs w:val="24"/>
           <w:lang w:val="en-US"/>
         </w:rPr>
-        <w:lastRenderedPageBreak/>
         <w:t xml:space="preserve">Heart rate in bpm </w:t>
       </w:r>
     </w:p>
@@ -20947,6 +21566,7 @@
         <w:rPr>
           <w:noProof/>
         </w:rPr>
+        <w:lastRenderedPageBreak/>
         <w:drawing>
           <wp:inline distT="0" distB="0" distL="0" distR="0" wp14:anchorId="11104798" wp14:editId="3C84FBC8">
             <wp:extent cx="4229100" cy="2943225"/>
@@ -21151,14 +21771,7 @@
         <w:rPr>
           <w:lang w:val="en-US"/>
         </w:rPr>
-        <w:t xml:space="preserve"> mainly handles container and carton </w:t>
-      </w:r>
-      <w:r>
-        <w:rPr>
-          <w:lang w:val="en-US"/>
-        </w:rPr>
-        <w:lastRenderedPageBreak/>
-        <w:t>board traffic, as well as other forest industry products, offering a diverse and representative setting for real</w:t>
+        <w:t xml:space="preserve"> mainly handles container and carton board traffic, as well as other forest industry products, offering a diverse and representative setting for real</w:t>
       </w:r>
       <w:r>
         <w:rPr>
@@ -21467,6 +22080,7 @@
                 <w:szCs w:val="21"/>
                 <w:lang w:eastAsia="en-US"/>
               </w:rPr>
+              <w:lastRenderedPageBreak/>
               <w:t>Name of the KPI: Sa4CPS UC KPI</w:t>
             </w:r>
           </w:p>
@@ -22668,6 +23282,7 @@
           <w:kern w:val="28"/>
           <w:sz w:val="28"/>
         </w:rPr>
+        <w:lastRenderedPageBreak/>
         <w:t>Conclusion</w:t>
       </w:r>
       <w:r>
@@ -24115,13 +24730,13 @@
             </wp:anchor>
           </w:drawing>
         </mc:Choice>
-        <mc:Fallback xmlns:arto="http://schemas.microsoft.com/office/word/2006/arto" xmlns:a14="http://schemas.microsoft.com/office/drawing/2010/main" xmlns:a="http://schemas.openxmlformats.org/drawingml/2006/main">
-          <w:pict w14:anchorId="0B6A42C8">
-            <v:shapetype id="_x0000_t202" coordsize="21600,21600" o:spt="202" path="m,l,21600r21600,l21600,xe" w14:anchorId="06EB24C6">
+        <mc:Fallback>
+          <w:pict>
+            <v:shapetype w14:anchorId="06EB24C6" id="_x0000_t202" coordsize="21600,21600" o:spt="202" path="m,l,21600r21600,l21600,xe">
               <v:stroke joinstyle="miter"/>
               <v:path gradientshapeok="t" o:connecttype="rect"/>
             </v:shapetype>
-            <v:shape id="Text Box 2" style="position:absolute;margin-left:305.45pt;margin-top:-21.45pt;width:193.4pt;height:60.1pt;z-index:251658240;visibility:visible;mso-wrap-style:square;mso-width-percent:400;mso-height-percent:200;mso-wrap-distance-left:9pt;mso-wrap-distance-top:0;mso-wrap-distance-right:9pt;mso-wrap-distance-bottom:0;mso-position-horizontal:absolute;mso-position-horizontal-relative:text;mso-position-vertical:absolute;mso-position-vertical-relative:text;mso-width-percent:400;mso-height-percent:200;mso-width-relative:margin;mso-height-relative:margin;v-text-anchor:top" o:spid="_x0000_s1026" stroked="f" type="#_x0000_t202" o:gfxdata="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">
+            <v:shape id="Text Box 2" o:spid="_x0000_s1026" type="#_x0000_t202" style="position:absolute;margin-left:305.45pt;margin-top:-21.45pt;width:193.4pt;height:60.1pt;z-index:251658240;visibility:visible;mso-wrap-style:square;mso-width-percent:400;mso-height-percent:200;mso-wrap-distance-left:9pt;mso-wrap-distance-top:0;mso-wrap-distance-right:9pt;mso-wrap-distance-bottom:0;mso-position-horizontal:absolute;mso-position-horizontal-relative:text;mso-position-vertical:absolute;mso-position-vertical-relative:text;mso-width-percent:400;mso-height-percent:200;mso-width-relative:margin;mso-height-relative:margin;v-text-anchor:top" o:gfxdata="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" stroked="f">
               <v:textbox style="mso-fit-shape-to-text:t">
                 <w:txbxContent>
                   <w:p>
@@ -24149,7 +24764,7 @@
                   </w:p>
                   <w:p>
                     <w:pPr>
-                      <w:pStyle w:val="BodyText"/>
+                      <w:pStyle w:val="Corpodetexto"/>
                       <w:rPr>
                         <w:b/>
                         <w:color w:val="009F47"/>
@@ -24221,7 +24836,7 @@
                   </w:p>
                   <w:p>
                     <w:pPr>
-                      <w:pStyle w:val="BodyText"/>
+                      <w:pStyle w:val="Corpodetexto"/>
                     </w:pPr>
                     <w:r>
                       <w:rPr>
@@ -30863,6 +31478,24 @@
       </w:tcPr>
     </w:tblStylePr>
   </w:style>
+  <w:style w:type="paragraph" w:customStyle="1" w:styleId="paragraph">
+    <w:name w:val="paragraph"/>
+    <w:basedOn w:val="Normal"/>
+    <w:rsid w:val="00845E53"/>
+    <w:pPr>
+      <w:spacing w:before="100" w:beforeAutospacing="1" w:after="100" w:afterAutospacing="1"/>
+    </w:pPr>
+    <w:rPr>
+      <w:rFonts w:ascii="Times New Roman" w:hAnsi="Times New Roman"/>
+      <w:sz w:val="24"/>
+      <w:lang w:val="pt-PT" w:eastAsia="pt-PT"/>
+    </w:rPr>
+  </w:style>
+  <w:style w:type="character" w:customStyle="1" w:styleId="eop">
+    <w:name w:val="eop"/>
+    <w:basedOn w:val="Tipodeletrapredefinidodopargrafo"/>
+    <w:rsid w:val="00845E53"/>
+  </w:style>
 </w:styles>
 </file>
 
@@ -31150,14 +31783,12 @@
 </file>
 
 <file path=customXml/item1.xml><?xml version="1.0" encoding="utf-8"?>
-<p:properties xmlns:p="http://schemas.microsoft.com/office/2006/metadata/properties" xmlns:xsi="http://www.w3.org/2001/XMLSchema-instance" xmlns:pc="http://schemas.microsoft.com/office/infopath/2007/PartnerControls">
-  <documentManagement>
-    <lcf76f155ced4ddcb4097134ff3c332f xmlns="7f0eec29-5b59-42d4-b14c-83db5fd944f4">
-      <Terms xmlns="http://schemas.microsoft.com/office/infopath/2007/PartnerControls"/>
-    </lcf76f155ced4ddcb4097134ff3c332f>
-    <TaxCatchAll xmlns="38eb9bcd-b5b1-4fa4-ba51-e2162eaf929d" xsi:nil="true"/>
-  </documentManagement>
-</p:properties>
+<?mso-contentType ?>
+<FormTemplates xmlns="http://schemas.microsoft.com/sharepoint/v3/contenttype/forms">
+  <Display>DocumentLibraryForm</Display>
+  <Edit>DocumentLibraryForm</Edit>
+  <New>DocumentLibraryForm</New>
+</FormTemplates>
 </file>
 
 <file path=customXml/item2.xml><?xml version="1.0" encoding="utf-8"?>
@@ -31238,12 +31869,14 @@
 </file>
 
 <file path=customXml/item3.xml><?xml version="1.0" encoding="utf-8"?>
-<?mso-contentType ?>
-<FormTemplates xmlns="http://schemas.microsoft.com/sharepoint/v3/contenttype/forms">
-  <Display>DocumentLibraryForm</Display>
-  <Edit>DocumentLibraryForm</Edit>
-  <New>DocumentLibraryForm</New>
-</FormTemplates>
+<p:properties xmlns:p="http://schemas.microsoft.com/office/2006/metadata/properties" xmlns:xsi="http://www.w3.org/2001/XMLSchema-instance" xmlns:pc="http://schemas.microsoft.com/office/infopath/2007/PartnerControls">
+  <documentManagement>
+    <lcf76f155ced4ddcb4097134ff3c332f xmlns="7f0eec29-5b59-42d4-b14c-83db5fd944f4">
+      <Terms xmlns="http://schemas.microsoft.com/office/infopath/2007/PartnerControls"/>
+    </lcf76f155ced4ddcb4097134ff3c332f>
+    <TaxCatchAll xmlns="38eb9bcd-b5b1-4fa4-ba51-e2162eaf929d" xsi:nil="true"/>
+  </documentManagement>
+</p:properties>
 </file>
 
 <file path=customXml/item4.xml><?xml version="1.0" encoding="utf-8"?>
@@ -31482,12 +32115,9 @@
 </file>
 
 <file path=customXml/itemProps1.xml><?xml version="1.0" encoding="utf-8"?>
-<ds:datastoreItem xmlns:ds="http://schemas.openxmlformats.org/officeDocument/2006/customXml" ds:itemID="{38594314-9A8C-424D-BC7D-4F88073C73B8}">
+<ds:datastoreItem xmlns:ds="http://schemas.openxmlformats.org/officeDocument/2006/customXml" ds:itemID="{50E05E5E-2EDC-4A1B-B535-D18DEF641685}">
   <ds:schemaRefs>
-    <ds:schemaRef ds:uri="http://schemas.microsoft.com/office/2006/metadata/properties"/>
-    <ds:schemaRef ds:uri="http://schemas.microsoft.com/office/infopath/2007/PartnerControls"/>
-    <ds:schemaRef ds:uri="7f0eec29-5b59-42d4-b14c-83db5fd944f4"/>
-    <ds:schemaRef ds:uri="38eb9bcd-b5b1-4fa4-ba51-e2162eaf929d"/>
+    <ds:schemaRef ds:uri="http://schemas.microsoft.com/sharepoint/v3/contenttype/forms"/>
   </ds:schemaRefs>
 </ds:datastoreItem>
 </file>
@@ -31501,9 +32131,12 @@
 </file>
 
 <file path=customXml/itemProps3.xml><?xml version="1.0" encoding="utf-8"?>
-<ds:datastoreItem xmlns:ds="http://schemas.openxmlformats.org/officeDocument/2006/customXml" ds:itemID="{50E05E5E-2EDC-4A1B-B535-D18DEF641685}">
+<ds:datastoreItem xmlns:ds="http://schemas.openxmlformats.org/officeDocument/2006/customXml" ds:itemID="{38594314-9A8C-424D-BC7D-4F88073C73B8}">
   <ds:schemaRefs>
-    <ds:schemaRef ds:uri="http://schemas.microsoft.com/sharepoint/v3/contenttype/forms"/>
+    <ds:schemaRef ds:uri="http://schemas.microsoft.com/office/2006/metadata/properties"/>
+    <ds:schemaRef ds:uri="http://schemas.microsoft.com/office/infopath/2007/PartnerControls"/>
+    <ds:schemaRef ds:uri="7f0eec29-5b59-42d4-b14c-83db5fd944f4"/>
+    <ds:schemaRef ds:uri="38eb9bcd-b5b1-4fa4-ba51-e2162eaf929d"/>
   </ds:schemaRefs>
 </ds:datastoreItem>
 </file>

</xml_diff>